<commit_message>
Added button icons. Updated built-in templates.
</commit_message>
<xml_diff>
--- a/app/db/seed_data/templates/DEFAULT_ENG_UKR_invoice.docx
+++ b/app/db/seed_data/templates/DEFAULT_ENG_UKR_invoice.docx
@@ -22,7 +22,7 @@
           <w:szCs w:val="28"/>
           <w:rtl w:val="0"/>
         </w:rPr>
-        <w:t xml:space="preserve">Invoice / Інвойс # {{ prefix, id, sep=”” }}</w:t>
+        <w:t xml:space="preserve">Invoice / Інвойс # {{ prefix }}{{ id }}</w:t>
       </w:r>
     </w:p>
     <w:p>
@@ -102,7 +102,7 @@
                 <w:szCs w:val="20"/>
                 <w:rtl w:val="0"/>
               </w:rPr>
-              <w:t xml:space="preserve">: {{ date }}</w:t>
+              <w:t xml:space="preserve">: {{ date.ENG }}</w:t>
             </w:r>
           </w:p>
         </w:tc>
@@ -135,7 +135,7 @@
                 <w:szCs w:val="20"/>
                 <w:rtl w:val="0"/>
               </w:rPr>
-              <w:t xml:space="preserve">: {{ date }} р.</w:t>
+              <w:t xml:space="preserve">: {{ date.UKR }}</w:t>
             </w:r>
           </w:p>
         </w:tc>
@@ -174,25 +174,9 @@
                 <w:szCs w:val="20"/>
                 <w:rtl w:val="0"/>
               </w:rPr>
-              <w:t xml:space="preserve"> {{ provider_type.ENG }}</w:t>
-            </w:r>
-          </w:p>
-          <w:p>
-            <w:pPr>
-              <w:spacing w:line="276" w:lineRule="auto"/>
-              <w:rPr>
-                <w:rFonts w:ascii="Arial" w:cs="Arial" w:eastAsia="Arial" w:hAnsi="Arial"/>
-                <w:sz w:val="20"/>
-                <w:szCs w:val="20"/>
-              </w:rPr>
-            </w:pPr>
-            <w:r>
-              <w:rPr>
-                <w:rFonts w:ascii="Arial" w:cs="Arial" w:eastAsia="Arial" w:hAnsi="Arial"/>
-                <w:sz w:val="20"/>
-                <w:szCs w:val="20"/>
-                <w:rtl w:val="0"/>
-              </w:rPr>
+              <w:br w:type="textWrapping"/>
+              <w:t xml:space="preserve">{{ provider_type.ENG }}</w:t>
+              <w:br w:type="textWrapping"/>
               <w:t xml:space="preserve">{{ provider_name.ENG }}</w:t>
             </w:r>
           </w:p>
@@ -226,21 +210,6 @@
             </w:pPr>
             <w:r>
               <w:rPr>
-                <w:rtl w:val="0"/>
-              </w:rPr>
-            </w:r>
-          </w:p>
-          <w:p>
-            <w:pPr>
-              <w:spacing w:line="276" w:lineRule="auto"/>
-              <w:rPr>
-                <w:rFonts w:ascii="Arial" w:cs="Arial" w:eastAsia="Arial" w:hAnsi="Arial"/>
-                <w:sz w:val="20"/>
-                <w:szCs w:val="20"/>
-              </w:rPr>
-            </w:pPr>
-            <w:r>
-              <w:rPr>
                 <w:rFonts w:ascii="Arial" w:cs="Arial" w:eastAsia="Arial" w:hAnsi="Arial"/>
                 <w:sz w:val="20"/>
                 <w:szCs w:val="20"/>
@@ -279,25 +248,10 @@
                 <w:szCs w:val="20"/>
                 <w:rtl w:val="0"/>
               </w:rPr>
-              <w:t xml:space="preserve">: {{ provider_type.UKR }}</w:t>
-            </w:r>
-          </w:p>
-          <w:p>
-            <w:pPr>
-              <w:spacing w:line="276" w:lineRule="auto"/>
-              <w:rPr>
-                <w:rFonts w:ascii="Arial" w:cs="Arial" w:eastAsia="Arial" w:hAnsi="Arial"/>
-                <w:sz w:val="20"/>
-                <w:szCs w:val="20"/>
-              </w:rPr>
-            </w:pPr>
-            <w:r>
-              <w:rPr>
-                <w:rFonts w:ascii="Arial" w:cs="Arial" w:eastAsia="Arial" w:hAnsi="Arial"/>
-                <w:sz w:val="20"/>
-                <w:szCs w:val="20"/>
-                <w:rtl w:val="0"/>
-              </w:rPr>
+              <w:t xml:space="preserve">:</w:t>
+              <w:br w:type="textWrapping"/>
+              <w:t xml:space="preserve">{{ provider_type.UKR }}</w:t>
+              <w:br w:type="textWrapping"/>
               <w:t xml:space="preserve">{{ provider_name.UKR }}</w:t>
             </w:r>
           </w:p>
@@ -318,21 +272,6 @@
                 <w:rtl w:val="0"/>
               </w:rPr>
               <w:t xml:space="preserve">{{ provider_address.UKR, provider_phone, provider_email, sep=”, “ }}</w:t>
-            </w:r>
-          </w:p>
-          <w:p>
-            <w:pPr>
-              <w:spacing w:line="276" w:lineRule="auto"/>
-              <w:rPr>
-                <w:rFonts w:ascii="Arial" w:cs="Arial" w:eastAsia="Arial" w:hAnsi="Arial"/>
-                <w:sz w:val="20"/>
-                <w:szCs w:val="20"/>
-              </w:rPr>
-            </w:pPr>
-            <w:r>
-              <w:rPr>
-                <w:rtl w:val="0"/>
-              </w:rPr>
             </w:r>
           </w:p>
           <w:p>
@@ -381,7 +320,8 @@
                 <w:szCs w:val="20"/>
                 <w:rtl w:val="0"/>
               </w:rPr>
-              <w:t xml:space="preserve">Customer: </w:t>
+              <w:t xml:space="preserve">Customer:</w:t>
+              <w:br w:type="textWrapping"/>
             </w:r>
             <w:r>
               <w:rPr>
@@ -391,24 +331,7 @@
                 <w:rtl w:val="0"/>
               </w:rPr>
               <w:t xml:space="preserve">{{ client_type.ENG }}</w:t>
-            </w:r>
-          </w:p>
-          <w:p>
-            <w:pPr>
-              <w:spacing w:line="276" w:lineRule="auto"/>
-              <w:rPr>
-                <w:rFonts w:ascii="Arial" w:cs="Arial" w:eastAsia="Arial" w:hAnsi="Arial"/>
-                <w:sz w:val="20"/>
-                <w:szCs w:val="20"/>
-              </w:rPr>
-            </w:pPr>
-            <w:r>
-              <w:rPr>
-                <w:rFonts w:ascii="Arial" w:cs="Arial" w:eastAsia="Arial" w:hAnsi="Arial"/>
-                <w:sz w:val="20"/>
-                <w:szCs w:val="20"/>
-                <w:rtl w:val="0"/>
-              </w:rPr>
+              <w:br w:type="textWrapping"/>
               <w:t xml:space="preserve">{{ client_name.ENG }}</w:t>
             </w:r>
           </w:p>
@@ -447,7 +370,7 @@
                 <w:szCs w:val="20"/>
                 <w:rtl w:val="0"/>
               </w:rPr>
-              <w:t xml:space="preserve">{{client_tax_sys.ENG}}: {{client_tax_id}}</w:t>
+              <w:t xml:space="preserve">{{ client_tax_sys.ENG }}: {{ client_tax_id }}</w:t>
             </w:r>
           </w:p>
         </w:tc>
@@ -480,25 +403,10 @@
                 <w:szCs w:val="20"/>
                 <w:rtl w:val="0"/>
               </w:rPr>
-              <w:t xml:space="preserve">: {{ client_type.UKR }}</w:t>
-            </w:r>
-          </w:p>
-          <w:p>
-            <w:pPr>
-              <w:spacing w:line="276" w:lineRule="auto"/>
-              <w:rPr>
-                <w:rFonts w:ascii="Arial" w:cs="Arial" w:eastAsia="Arial" w:hAnsi="Arial"/>
-                <w:sz w:val="20"/>
-                <w:szCs w:val="20"/>
-              </w:rPr>
-            </w:pPr>
-            <w:r>
-              <w:rPr>
-                <w:rFonts w:ascii="Arial" w:cs="Arial" w:eastAsia="Arial" w:hAnsi="Arial"/>
-                <w:sz w:val="20"/>
-                <w:szCs w:val="20"/>
-                <w:rtl w:val="0"/>
-              </w:rPr>
+              <w:t xml:space="preserve">:</w:t>
+              <w:br w:type="textWrapping"/>
+              <w:t xml:space="preserve">{{ client_type.UKR }}</w:t>
+              <w:br w:type="textWrapping"/>
               <w:t xml:space="preserve">{{ client_name.UKR }}</w:t>
             </w:r>
           </w:p>
@@ -537,7 +445,7 @@
                 <w:szCs w:val="20"/>
                 <w:rtl w:val="0"/>
               </w:rPr>
-              <w:t xml:space="preserve">{{client_tax_sys.UKR}}: {{client_tax_id}}</w:t>
+              <w:t xml:space="preserve">{{ client_tax_sys.UKR }}: {{ client_tax_id }}</w:t>
             </w:r>
           </w:p>
         </w:tc>
@@ -885,69 +793,53 @@
                 <w:szCs w:val="20"/>
                 <w:rtl w:val="0"/>
               </w:rPr>
-              <w:t xml:space="preserve">Beneficiary: {{provider_type.ENG}} {{provider_name.ENG}}</w:t>
-            </w:r>
-          </w:p>
-          <w:p>
-            <w:pPr>
-              <w:spacing w:line="276" w:lineRule="auto"/>
-              <w:rPr>
-                <w:rFonts w:ascii="Arial" w:cs="Arial" w:eastAsia="Arial" w:hAnsi="Arial"/>
-                <w:sz w:val="20"/>
-                <w:szCs w:val="20"/>
-              </w:rPr>
-            </w:pPr>
-            <w:r>
-              <w:rPr>
-                <w:rFonts w:ascii="Arial" w:cs="Arial" w:eastAsia="Arial" w:hAnsi="Arial"/>
-                <w:sz w:val="20"/>
-                <w:szCs w:val="20"/>
-                <w:rtl w:val="0"/>
-              </w:rPr>
-              <w:t xml:space="preserve">Account (IBAN): {{provider_iban}}</w:t>
-            </w:r>
-          </w:p>
-          <w:p>
-            <w:pPr>
-              <w:spacing w:line="276" w:lineRule="auto"/>
-              <w:rPr>
-                <w:rFonts w:ascii="Arial" w:cs="Arial" w:eastAsia="Arial" w:hAnsi="Arial"/>
-                <w:sz w:val="20"/>
-                <w:szCs w:val="20"/>
-              </w:rPr>
-            </w:pPr>
-            <w:r>
-              <w:rPr>
-                <w:rFonts w:ascii="Arial" w:cs="Arial" w:eastAsia="Arial" w:hAnsi="Arial"/>
-                <w:sz w:val="20"/>
-                <w:szCs w:val="20"/>
-                <w:rtl w:val="0"/>
-              </w:rPr>
-              <w:t xml:space="preserve">Beneficiary’s bank: {{provider_bank_name, provider_bank_info, sep=”, “}}</w:t>
-            </w:r>
-          </w:p>
-          <w:p>
-            <w:pPr>
-              <w:spacing w:line="276" w:lineRule="auto"/>
-              <w:rPr>
-                <w:rFonts w:ascii="Arial" w:cs="Arial" w:eastAsia="Arial" w:hAnsi="Arial"/>
-                <w:sz w:val="20"/>
-                <w:szCs w:val="20"/>
-              </w:rPr>
-            </w:pPr>
-            <w:r>
-              <w:rPr>
-                <w:rFonts w:ascii="Arial" w:cs="Arial" w:eastAsia="Arial" w:hAnsi="Arial"/>
-                <w:sz w:val="20"/>
-                <w:szCs w:val="20"/>
-                <w:rtl w:val="0"/>
-              </w:rPr>
-              <w:t xml:space="preserve">SWIFT code: {{provider_swift}}</w:t>
+              <w:t xml:space="preserve">Beneficiary: {{ provider_type.ENG }} {{ provider_name.ENG }}</w:t>
+            </w:r>
+          </w:p>
+          <w:p>
+            <w:pPr>
+              <w:spacing w:line="276" w:lineRule="auto"/>
+              <w:rPr>
+                <w:rFonts w:ascii="Arial" w:cs="Arial" w:eastAsia="Arial" w:hAnsi="Arial"/>
+                <w:sz w:val="20"/>
+                <w:szCs w:val="20"/>
+              </w:rPr>
+            </w:pPr>
+            <w:r>
+              <w:rPr>
+                <w:rFonts w:ascii="Arial" w:cs="Arial" w:eastAsia="Arial" w:hAnsi="Arial"/>
+                <w:sz w:val="20"/>
+                <w:szCs w:val="20"/>
+                <w:rtl w:val="0"/>
+              </w:rPr>
+              <w:t xml:space="preserve">{{ ( (“Account (IBAN): “, provider_iban),</w:t>
+              <w:br w:type="textWrapping"/>
+              <w:t xml:space="preserve">(“Beneficiary’s bank: “, provider_bank_name, “, “, provider_bank_info),</w:t>
+              <w:br w:type="textWrapping"/>
+              <w:t xml:space="preserve">(“SWIFT code: “, provider_swift) ), sep=”\n” }}</w:t>
             </w:r>
           </w:p>
         </w:tc>
       </w:tr>
     </w:tbl>
+    <w:p>
+      <w:pPr>
+        <w:spacing w:line="276" w:lineRule="auto"/>
+        <w:rPr>
+          <w:rFonts w:ascii="Arial" w:cs="Arial" w:eastAsia="Arial" w:hAnsi="Arial"/>
+          <w:sz w:val="20"/>
+          <w:szCs w:val="20"/>
+        </w:rPr>
+      </w:pPr>
+      <w:r>
+        <w:br w:type="page"/>
+      </w:r>
+      <w:r>
+        <w:rPr>
+          <w:rtl w:val="0"/>
+        </w:rPr>
+      </w:r>
+    </w:p>
     <w:p>
       <w:pPr>
         <w:spacing w:line="276" w:lineRule="auto"/>
@@ -1393,7 +1285,7 @@
           <w:p>
             <w:pPr>
               <w:spacing w:line="276" w:lineRule="auto"/>
-              <w:jc w:val="right"/>
+              <w:jc w:val="center"/>
               <w:rPr>
                 <w:rFonts w:ascii="Arial" w:cs="Arial" w:eastAsia="Arial" w:hAnsi="Arial"/>
                 <w:sz w:val="16"/>
@@ -1466,7 +1358,6 @@
             <w:pPr>
               <w:keepNext w:val="0"/>
               <w:keepLines w:val="0"/>
-              <w:pageBreakBefore w:val="0"/>
               <w:widowControl w:val="0"/>
               <w:pBdr>
                 <w:top w:space="0" w:sz="0" w:val="nil"/>
@@ -1540,7 +1431,7 @@
           <w:p>
             <w:pPr>
               <w:spacing w:line="276" w:lineRule="auto"/>
-              <w:jc w:val="right"/>
+              <w:jc w:val="center"/>
               <w:rPr>
                 <w:rFonts w:ascii="Arial" w:cs="Arial" w:eastAsia="Arial" w:hAnsi="Arial"/>
                 <w:sz w:val="16"/>
@@ -1569,24 +1460,6 @@
           <w:szCs w:val="20"/>
         </w:rPr>
       </w:pPr>
-      <w:r>
-        <w:rPr>
-          <w:rtl w:val="0"/>
-        </w:rPr>
-      </w:r>
-    </w:p>
-    <w:p>
-      <w:pPr>
-        <w:spacing w:line="276" w:lineRule="auto"/>
-        <w:rPr>
-          <w:rFonts w:ascii="Arial" w:cs="Arial" w:eastAsia="Arial" w:hAnsi="Arial"/>
-          <w:sz w:val="20"/>
-          <w:szCs w:val="20"/>
-        </w:rPr>
-      </w:pPr>
-      <w:r>
-        <w:br w:type="page"/>
-      </w:r>
       <w:r>
         <w:rPr>
           <w:rtl w:val="0"/>
@@ -1719,7 +1592,7 @@
           <w:szCs w:val="20"/>
           <w:rtl w:val="0"/>
         </w:rPr>
-        <w:t xml:space="preserve">Supplier/Виконавець: _______________________ ({{provider_rep_name.ENG}} / {{provider_rep_name.UKR}})</w:t>
+        <w:t xml:space="preserve">Supplier/Виконавець: _______________________ {{( ( “(“, provider_rep_name.ENG, “/”, provider_rep_name.UKR, “)” ) )}}</w:t>
       </w:r>
       <w:r>
         <w:rPr>
@@ -1880,6 +1753,52 @@
       <w:sz w:val="72"/>
       <w:szCs w:val="72"/>
     </w:rPr>
+  </w:style>
+  <w:style w:type="table" w:styleId="TableNormal" w:default="1">
+    <w:name w:val="TableNormal"/>
+    <w:tblPr>
+      <w:tblCellMar>
+        <w:top w:w="100.0" w:type="dxa"/>
+        <w:left w:w="100.0" w:type="dxa"/>
+        <w:bottom w:w="100.0" w:type="dxa"/>
+        <w:right w:w="100.0" w:type="dxa"/>
+      </w:tblCellMar>
+    </w:tblPr>
+  </w:style>
+  <w:style w:type="paragraph" w:styleId="Normal" w:default="1">
+    <w:name w:val="normal"/>
+  </w:style>
+  <w:style w:type="table" w:styleId="Table1">
+    <w:basedOn w:val="TableNormal"/>
+    <w:pPr>
+      <w:spacing w:after="0" w:line="240" w:lineRule="auto"/>
+    </w:pPr>
+    <w:tblPr>
+      <w:tblStyleRowBandSize w:val="1"/>
+      <w:tblStyleColBandSize w:val="1"/>
+      <w:tblCellMar>
+        <w:top w:w="0.0" w:type="dxa"/>
+        <w:left w:w="108.0" w:type="dxa"/>
+        <w:bottom w:w="0.0" w:type="dxa"/>
+        <w:right w:w="108.0" w:type="dxa"/>
+      </w:tblCellMar>
+    </w:tblPr>
+  </w:style>
+  <w:style w:type="table" w:styleId="Table2">
+    <w:basedOn w:val="TableNormal"/>
+    <w:pPr>
+      <w:spacing w:after="0" w:line="240" w:lineRule="auto"/>
+    </w:pPr>
+    <w:tblPr>
+      <w:tblStyleRowBandSize w:val="1"/>
+      <w:tblStyleColBandSize w:val="1"/>
+      <w:tblCellMar>
+        <w:top w:w="0.0" w:type="dxa"/>
+        <w:left w:w="108.0" w:type="dxa"/>
+        <w:bottom w:w="0.0" w:type="dxa"/>
+        <w:right w:w="108.0" w:type="dxa"/>
+      </w:tblCellMar>
+    </w:tblPr>
   </w:style>
   <w:style w:type="paragraph" w:styleId="Subtitle">
     <w:name w:val="Subtitle"/>
@@ -2256,7 +2175,7 @@
 
 <file path=customXML/item1.xml><?xml version="1.0" encoding="utf-8"?>
 <go:gDocsCustomXmlDataStorage xmlns:go="http://customooxmlschemas.google.com/" xmlns:r="http://schemas.openxmlformats.org/officeDocument/2006/relationships" uri="GoogleDocsCustomDataVersion2">
-  <go:docsCustomData xmlns:go="http://customooxmlschemas.google.com/" roundtripDataSignature="AMtx7mgeQXcYy1fvFvPn1OZwhgsrE+HPbA==">CgMxLjA4AHIhMVVZNzNqWXhSSE1WUmROY3BUVGhyMmVSMmplV0NNZTRa</go:docsCustomData>
+  <go:docsCustomData xmlns:go="http://customooxmlschemas.google.com/" roundtripDataSignature="AMtx7mjCUUspzDAjcj9MED5AziNIimtAYQ==">CgMxLjA4AHIhMXNaWlFCUkZKRFdqdDhSUG9rd0JzTWdHT0o0N0xnd2Vo</go:docsCustomData>
 </go:gDocsCustomXmlDataStorage>
 </file>
 

</xml_diff>